<commit_message>
Fix template file corruption: generate native DOCX and DOTX formats using Word XML engine
</commit_message>
<xml_diff>
--- a/client/public/downloads/JPSG_First_Page_Template.docx
+++ b/client/public/downloads/JPSG_First_Page_Template.docx
@@ -499,10 +499,10 @@
             <w:pPr>
               <w:spacing w:line="276" w:lineRule="auto"/>
               <w:rPr>
-                <w:color w:val="FFFFFF"/>
                 <w:b/>
                 <w:bCs/>
                 <w:iCs/>
+                <w:color w:val="FFFFFF"/>
                 <w:sz w:val="22"/>
                 <w:szCs w:val="22"/>
               </w:rPr>
@@ -1358,7 +1358,6 @@
             <w:left w:val="single" w:sz="4" w:space="0" w:color="1B365D"/>
             <w:right w:val="single" w:sz="4" w:space="0" w:color="1B365D"/>
           </w:tcBorders>
-          <w:shd w:val="clear" w:color="auto" w:fill="auto"/>
           <w:vAlign w:val="center"/>
         </w:tcPr>
         <w:p>
@@ -1430,7 +1429,6 @@
             <w:bottom w:val="single" w:sz="4" w:space="0" w:color="1B365D"/>
             <w:right w:val="single" w:sz="4" w:space="0" w:color="1B365D"/>
           </w:tcBorders>
-          <w:shd w:val="clear" w:color="auto" w:fill="auto"/>
           <w:vAlign w:val="center"/>
         </w:tcPr>
         <w:p>
@@ -1525,7 +1523,6 @@
             <w:bottom w:val="single" w:sz="4" w:space="0" w:color="1B365D"/>
             <w:right w:val="single" w:sz="4" w:space="0" w:color="1B365D"/>
           </w:tcBorders>
-          <w:shd w:val="clear" w:color="auto" w:fill="auto"/>
           <w:vAlign w:val="center"/>
         </w:tcPr>
         <w:p>
@@ -1596,7 +1593,6 @@
             <w:bottom w:val="single" w:sz="4" w:space="0" w:color="1B365D"/>
             <w:right w:val="single" w:sz="4" w:space="0" w:color="1B365D"/>
           </w:tcBorders>
-          <w:shd w:val="clear" w:color="auto" w:fill="auto"/>
           <w:vAlign w:val="center"/>
         </w:tcPr>
         <w:p>
@@ -1619,7 +1615,6 @@
             <w:bottom w:val="single" w:sz="4" w:space="0" w:color="1B365D"/>
             <w:right w:val="single" w:sz="4" w:space="0" w:color="1B365D"/>
           </w:tcBorders>
-          <w:shd w:val="clear" w:color="auto" w:fill="auto"/>
           <w:vAlign w:val="center"/>
         </w:tcPr>
         <w:p>

</xml_diff>